<commit_message>
Fix sample strategy memo font (Yu Mincho → MS Pフォント)
The strategy memo .docx specified "Yu Mincho" / "Yu Gothic" as
the font for both Latin and East Asian characters. These fonts
ship only with Windows 10+, so when opened in Google Docs,
Word for Mac, or older Word versions, the font wasn't found and
Japanese characters rendered as squares (mojibake).

Switching to MS P明朝 / MS Pゴシック which are bundled with all
Japanese Windows since Win95 and substituted appropriately by
Word for Mac and Google Docs.

Also separating Latin (Calibri) from East Asian font, so ASCII
text no longer borrows the Japanese font's Latin glyphs.

Affected:
  sample_data/サンプル商事_来期戦略メモ.docx
  dist/build_sample_data.py (script updated for future regen)

Co-Authored-By: Claude Opus 4.7 (1M context) <noreply@anthropic.com>
</commit_message>
<xml_diff>
--- a/sample_data/サンプル商事_来期戦略メモ.docx
+++ b/sample_data/サンプル商事_来期戦略メモ.docx
@@ -8,7 +8,7 @@
       </w:pPr>
       <w:r>
         <w:rPr>
-          <w:rFonts w:ascii="Yu Gothic" w:hAnsi="Yu Gothic" w:eastAsia="Yu Gothic"/>
+          <w:rFonts w:eastAsia="ＭＳ Ｐゴシック" w:ascii="Calibri" w:hAnsi="Calibri"/>
           <w:b/>
           <w:color w:val="4A2BD4"/>
           <w:sz w:val="36"/>
@@ -22,7 +22,7 @@
       </w:pPr>
       <w:r>
         <w:rPr>
-          <w:rFonts w:ascii="Yu Gothic" w:hAnsi="Yu Gothic" w:eastAsia="Yu Gothic"/>
+          <w:rFonts w:eastAsia="ＭＳ Ｐゴシック" w:ascii="Calibri" w:hAnsi="Calibri"/>
           <w:b w:val="0"/>
           <w:color w:val="6B7280"/>
           <w:sz w:val="24"/>
@@ -36,7 +36,7 @@
       </w:pPr>
       <w:r>
         <w:rPr>
-          <w:rFonts w:ascii="Yu Mincho" w:hAnsi="Yu Mincho" w:eastAsia="Yu Mincho"/>
+          <w:rFonts w:eastAsia="ＭＳ Ｐ明朝" w:ascii="Calibri" w:hAnsi="Calibri"/>
           <w:b w:val="0"/>
           <w:color w:val="6B7280"/>
           <w:sz w:val="18"/>
@@ -51,7 +51,7 @@
       </w:pPr>
       <w:r>
         <w:rPr>
-          <w:rFonts w:ascii="Yu Gothic" w:hAnsi="Yu Gothic" w:eastAsia="Yu Gothic"/>
+          <w:rFonts w:eastAsia="ＭＳ Ｐゴシック" w:ascii="Calibri" w:hAnsi="Calibri"/>
           <w:b/>
           <w:color w:val="4A2BD4"/>
           <w:sz w:val="26"/>
@@ -65,7 +65,7 @@
       </w:pPr>
       <w:r>
         <w:rPr>
-          <w:rFonts w:ascii="Yu Mincho" w:hAnsi="Yu Mincho" w:eastAsia="Yu Mincho"/>
+          <w:rFonts w:eastAsia="ＭＳ Ｐ明朝" w:ascii="Calibri" w:hAnsi="Calibri"/>
           <w:b w:val="0"/>
           <w:sz w:val="21"/>
         </w:rPr>
@@ -78,7 +78,7 @@
       </w:pPr>
       <w:r>
         <w:rPr>
-          <w:rFonts w:ascii="Yu Gothic" w:hAnsi="Yu Gothic" w:eastAsia="Yu Gothic"/>
+          <w:rFonts w:eastAsia="ＭＳ Ｐゴシック" w:ascii="Calibri" w:hAnsi="Calibri"/>
           <w:b/>
           <w:color w:val="4A2BD4"/>
           <w:sz w:val="26"/>
@@ -92,7 +92,7 @@
       </w:pPr>
       <w:r>
         <w:rPr>
-          <w:rFonts w:ascii="Yu Mincho" w:hAnsi="Yu Mincho" w:eastAsia="Yu Mincho"/>
+          <w:rFonts w:eastAsia="ＭＳ Ｐ明朝" w:ascii="Calibri" w:hAnsi="Calibri"/>
           <w:b w:val="0"/>
           <w:sz w:val="21"/>
         </w:rPr>
@@ -105,7 +105,7 @@
       </w:pPr>
       <w:r>
         <w:rPr>
-          <w:rFonts w:ascii="Yu Gothic" w:hAnsi="Yu Gothic" w:eastAsia="Yu Gothic"/>
+          <w:rFonts w:eastAsia="ＭＳ Ｐゴシック" w:ascii="Calibri" w:hAnsi="Calibri"/>
           <w:b/>
           <w:color w:val="4A2BD4"/>
           <w:sz w:val="26"/>
@@ -119,7 +119,7 @@
       </w:pPr>
       <w:r>
         <w:rPr>
-          <w:rFonts w:ascii="Yu Mincho" w:hAnsi="Yu Mincho" w:eastAsia="Yu Mincho"/>
+          <w:rFonts w:eastAsia="ＭＳ Ｐ明朝" w:ascii="Calibri" w:hAnsi="Calibri"/>
           <w:b w:val="0"/>
           <w:sz w:val="21"/>
         </w:rPr>
@@ -136,7 +136,7 @@
       </w:pPr>
       <w:r>
         <w:rPr>
-          <w:rFonts w:ascii="Yu Gothic" w:hAnsi="Yu Gothic" w:eastAsia="Yu Gothic"/>
+          <w:rFonts w:eastAsia="ＭＳ Ｐゴシック" w:ascii="Calibri" w:hAnsi="Calibri"/>
           <w:b/>
           <w:color w:val="4A2BD4"/>
           <w:sz w:val="26"/>
@@ -150,7 +150,7 @@
       </w:pPr>
       <w:r>
         <w:rPr>
-          <w:rFonts w:ascii="Yu Mincho" w:hAnsi="Yu Mincho" w:eastAsia="Yu Mincho"/>
+          <w:rFonts w:eastAsia="ＭＳ Ｐ明朝" w:ascii="Calibri" w:hAnsi="Calibri"/>
           <w:b w:val="0"/>
           <w:sz w:val="21"/>
         </w:rPr>
@@ -163,7 +163,7 @@
       </w:pPr>
       <w:r>
         <w:rPr>
-          <w:rFonts w:ascii="Yu Gothic" w:hAnsi="Yu Gothic" w:eastAsia="Yu Gothic"/>
+          <w:rFonts w:eastAsia="ＭＳ Ｐゴシック" w:ascii="Calibri" w:hAnsi="Calibri"/>
           <w:b/>
           <w:color w:val="4A2BD4"/>
           <w:sz w:val="26"/>
@@ -177,7 +177,7 @@
       </w:pPr>
       <w:r>
         <w:rPr>
-          <w:rFonts w:ascii="Yu Mincho" w:hAnsi="Yu Mincho" w:eastAsia="Yu Mincho"/>
+          <w:rFonts w:eastAsia="ＭＳ Ｐ明朝" w:ascii="Calibri" w:hAnsi="Calibri"/>
           <w:b w:val="0"/>
           <w:sz w:val="21"/>
         </w:rPr>
@@ -196,7 +196,7 @@
       </w:pPr>
       <w:r>
         <w:rPr>
-          <w:rFonts w:ascii="Yu Gothic" w:hAnsi="Yu Gothic" w:eastAsia="Yu Gothic"/>
+          <w:rFonts w:eastAsia="ＭＳ Ｐゴシック" w:ascii="Calibri" w:hAnsi="Calibri"/>
           <w:b/>
           <w:color w:val="4A2BD4"/>
           <w:sz w:val="26"/>
@@ -210,7 +210,7 @@
       </w:pPr>
       <w:r>
         <w:rPr>
-          <w:rFonts w:ascii="Yu Mincho" w:hAnsi="Yu Mincho" w:eastAsia="Yu Mincho"/>
+          <w:rFonts w:eastAsia="ＭＳ Ｐ明朝" w:ascii="Calibri" w:hAnsi="Calibri"/>
           <w:b w:val="0"/>
           <w:sz w:val="21"/>
         </w:rPr>
@@ -223,7 +223,7 @@
       </w:pPr>
       <w:r>
         <w:rPr>
-          <w:rFonts w:ascii="Yu Gothic" w:hAnsi="Yu Gothic" w:eastAsia="Yu Gothic"/>
+          <w:rFonts w:eastAsia="ＭＳ Ｐゴシック" w:ascii="Calibri" w:hAnsi="Calibri"/>
           <w:b/>
           <w:color w:val="4A2BD4"/>
           <w:sz w:val="26"/>
@@ -237,7 +237,7 @@
       </w:pPr>
       <w:r>
         <w:rPr>
-          <w:rFonts w:ascii="Yu Mincho" w:hAnsi="Yu Mincho" w:eastAsia="Yu Mincho"/>
+          <w:rFonts w:eastAsia="ＭＳ Ｐ明朝" w:ascii="Calibri" w:hAnsi="Calibri"/>
           <w:b w:val="0"/>
           <w:sz w:val="21"/>
         </w:rPr>
@@ -254,7 +254,7 @@
       </w:pPr>
       <w:r>
         <w:rPr>
-          <w:rFonts w:ascii="Yu Gothic" w:hAnsi="Yu Gothic" w:eastAsia="Yu Gothic"/>
+          <w:rFonts w:eastAsia="ＭＳ Ｐゴシック" w:ascii="Calibri" w:hAnsi="Calibri"/>
           <w:b/>
           <w:color w:val="4A2BD4"/>
           <w:sz w:val="26"/>
@@ -268,7 +268,7 @@
       </w:pPr>
       <w:r>
         <w:rPr>
-          <w:rFonts w:ascii="Yu Mincho" w:hAnsi="Yu Mincho" w:eastAsia="Yu Mincho"/>
+          <w:rFonts w:eastAsia="ＭＳ Ｐ明朝" w:ascii="Calibri" w:hAnsi="Calibri"/>
           <w:b w:val="0"/>
           <w:sz w:val="21"/>
         </w:rPr>
@@ -655,7 +655,7 @@
     <w:qFormat/>
     <w:rsid w:val="00FC693F"/>
     <w:rPr>
-      <w:rFonts w:ascii="Yu Mincho" w:hAnsi="Yu Mincho" w:eastAsia="Yu Mincho"/>
+      <w:rFonts w:ascii="Calibri" w:hAnsi="Calibri" w:eastAsia="ＭＳ Ｐ明朝"/>
       <w:sz w:val="21"/>
     </w:rPr>
   </w:style>

</xml_diff>